<commit_message>
Clean all 0s in data, export the final data output into a file Excel, plot the normalized data & standardized data following PDF
</commit_message>
<xml_diff>
--- a/docs/Minutes of Meeting.docx
+++ b/docs/Minutes of Meeting.docx
@@ -50,6 +50,13 @@
         </w:rPr>
         <w:t>Xuất data sau khi concatenate final thành 1 file excel để double check lần nữa</w:t>
       </w:r>
+      <w:r>
+        <w:rPr>
+          <w:sz w:val="24"/>
+          <w:szCs w:val="24"/>
+        </w:rPr>
+        <w:t xml:space="preserve"> (Done)</w:t>
+      </w:r>
     </w:p>
     <w:p>
       <w:pPr>
@@ -70,6 +77,13 @@
         </w:rPr>
         <w:t>Clean data thêm 1 cách: chỉ lấy dữ liệu từ 7h sáng - 5h chiều (trong khoảng thời gian đó, nếu chỗ nào data = 0 thì lấy cái liền kề trước/ sau để fill in vào)</w:t>
       </w:r>
+      <w:r>
+        <w:rPr>
+          <w:sz w:val="24"/>
+          <w:szCs w:val="24"/>
+        </w:rPr>
+        <w:t xml:space="preserve"> (Done)</w:t>
+      </w:r>
     </w:p>
     <w:p>
       <w:pPr>
@@ -81,12 +95,14 @@
         <w:rPr>
           <w:sz w:val="24"/>
           <w:szCs w:val="24"/>
-        </w:rPr>
-      </w:pPr>
-      <w:r>
-        <w:rPr>
-          <w:sz w:val="24"/>
-          <w:szCs w:val="24"/>
+          <w:highlight w:val="yellow"/>
+        </w:rPr>
+      </w:pPr>
+      <w:r>
+        <w:rPr>
+          <w:sz w:val="24"/>
+          <w:szCs w:val="24"/>
+          <w:highlight w:val="yellow"/>
         </w:rPr>
         <w:t>Gửi lại thầy các bài báo có highlight để thầy check lại (lần sau họp offline mang theo)</w:t>
       </w:r>
@@ -110,6 +126,13 @@
         </w:rPr>
         <w:t>Plot lại sau khi normalize để dễ check hơn</w:t>
       </w:r>
+      <w:r>
+        <w:rPr>
+          <w:sz w:val="24"/>
+          <w:szCs w:val="24"/>
+        </w:rPr>
+        <w:t xml:space="preserve"> (Done)</w:t>
+      </w:r>
     </w:p>
     <w:p>
       <w:pPr>
@@ -121,12 +144,14 @@
         <w:rPr>
           <w:sz w:val="24"/>
           <w:szCs w:val="24"/>
-        </w:rPr>
-      </w:pPr>
-      <w:r>
-        <w:rPr>
-          <w:sz w:val="24"/>
-          <w:szCs w:val="24"/>
+          <w:highlight w:val="yellow"/>
+        </w:rPr>
+      </w:pPr>
+      <w:r>
+        <w:rPr>
+          <w:sz w:val="24"/>
+          <w:szCs w:val="24"/>
+          <w:highlight w:val="yellow"/>
         </w:rPr>
         <w:t xml:space="preserve">Sau khi Standardize thì vẽ hàm pdf (probability distribution) </w:t>
       </w:r>
@@ -134,6 +159,7 @@
         <w:rPr>
           <w:sz w:val="24"/>
           <w:szCs w:val="24"/>
+          <w:highlight w:val="yellow"/>
         </w:rPr>
         <w:sym w:font="Wingdings" w:char="F0E0"/>
       </w:r>
@@ -141,6 +167,7 @@
         <w:rPr>
           <w:sz w:val="24"/>
           <w:szCs w:val="24"/>
+          <w:highlight w:val="yellow"/>
         </w:rPr>
         <w:t xml:space="preserve"> check coi có ra hàm normal k</w:t>
       </w:r>
@@ -148,6 +175,7 @@
         <w:rPr>
           <w:sz w:val="24"/>
           <w:szCs w:val="24"/>
+          <w:highlight w:val="yellow"/>
         </w:rPr>
         <w:t>hông</w:t>
       </w:r>
@@ -162,12 +190,14 @@
         <w:rPr>
           <w:sz w:val="24"/>
           <w:szCs w:val="24"/>
-        </w:rPr>
-      </w:pPr>
-      <w:r>
-        <w:rPr>
-          <w:sz w:val="24"/>
-          <w:szCs w:val="24"/>
+          <w:highlight w:val="yellow"/>
+        </w:rPr>
+      </w:pPr>
+      <w:r>
+        <w:rPr>
+          <w:sz w:val="24"/>
+          <w:szCs w:val="24"/>
+          <w:highlight w:val="yellow"/>
         </w:rPr>
         <w:t>Convert lại sau khi predict để plot lại (dành cho lúc chạy LSTM)</w:t>
       </w:r>
@@ -188,22 +218,9 @@
         <w:rPr>
           <w:sz w:val="24"/>
           <w:szCs w:val="24"/>
-        </w:rPr>
-        <w:t>Tuần sau chạy báo</w:t>
-      </w:r>
-      <w:r>
-        <w:rPr>
-          <w:sz w:val="24"/>
-          <w:szCs w:val="24"/>
-        </w:rPr>
-        <w:t xml:space="preserve"> cáo</w:t>
-      </w:r>
-      <w:r>
-        <w:rPr>
-          <w:sz w:val="24"/>
-          <w:szCs w:val="24"/>
-        </w:rPr>
-        <w:t xml:space="preserve"> LSTM &amp; CNN (chủ yếu CNN vì chưa chạy)</w:t>
+          <w:highlight w:val="yellow"/>
+        </w:rPr>
+        <w:t>Tuần sau chạy báo cáo LSTM &amp; CNN (chủ yếu CNN vì chưa chạy)</w:t>
       </w:r>
     </w:p>
     <w:sectPr>

</xml_diff>

<commit_message>
Run CNN model with new cleaned data (22) & plot std data instead of original data
</commit_message>
<xml_diff>
--- a/docs/Minutes of Meeting.docx
+++ b/docs/Minutes of Meeting.docx
@@ -95,16 +95,21 @@
         <w:rPr>
           <w:sz w:val="24"/>
           <w:szCs w:val="24"/>
-          <w:highlight w:val="yellow"/>
-        </w:rPr>
-      </w:pPr>
-      <w:r>
-        <w:rPr>
-          <w:sz w:val="24"/>
-          <w:szCs w:val="24"/>
-          <w:highlight w:val="yellow"/>
+        </w:rPr>
+      </w:pPr>
+      <w:r>
+        <w:rPr>
+          <w:sz w:val="24"/>
+          <w:szCs w:val="24"/>
         </w:rPr>
         <w:t>Gửi lại thầy các bài báo có highlight để thầy check lại (lần sau họp offline mang theo)</w:t>
+      </w:r>
+      <w:r>
+        <w:rPr>
+          <w:sz w:val="24"/>
+          <w:szCs w:val="24"/>
+        </w:rPr>
+        <w:t xml:space="preserve"> (Done)</w:t>
       </w:r>
     </w:p>
     <w:p>
@@ -144,14 +149,12 @@
         <w:rPr>
           <w:sz w:val="24"/>
           <w:szCs w:val="24"/>
-          <w:highlight w:val="yellow"/>
-        </w:rPr>
-      </w:pPr>
-      <w:r>
-        <w:rPr>
-          <w:sz w:val="24"/>
-          <w:szCs w:val="24"/>
-          <w:highlight w:val="yellow"/>
+        </w:rPr>
+      </w:pPr>
+      <w:r>
+        <w:rPr>
+          <w:sz w:val="24"/>
+          <w:szCs w:val="24"/>
         </w:rPr>
         <w:t xml:space="preserve">Sau khi Standardize thì vẽ hàm pdf (probability distribution) </w:t>
       </w:r>
@@ -159,7 +162,6 @@
         <w:rPr>
           <w:sz w:val="24"/>
           <w:szCs w:val="24"/>
-          <w:highlight w:val="yellow"/>
         </w:rPr>
         <w:sym w:font="Wingdings" w:char="F0E0"/>
       </w:r>
@@ -167,7 +169,6 @@
         <w:rPr>
           <w:sz w:val="24"/>
           <w:szCs w:val="24"/>
-          <w:highlight w:val="yellow"/>
         </w:rPr>
         <w:t xml:space="preserve"> check coi có ra hàm normal k</w:t>
       </w:r>
@@ -175,9 +176,15 @@
         <w:rPr>
           <w:sz w:val="24"/>
           <w:szCs w:val="24"/>
-          <w:highlight w:val="yellow"/>
         </w:rPr>
         <w:t>hông</w:t>
+      </w:r>
+      <w:r>
+        <w:rPr>
+          <w:sz w:val="24"/>
+          <w:szCs w:val="24"/>
+        </w:rPr>
+        <w:t xml:space="preserve"> (Done)</w:t>
       </w:r>
     </w:p>
     <w:p>

</xml_diff>

<commit_message>
Run CNN-LSTM models (23)
</commit_message>
<xml_diff>
--- a/docs/Minutes of Meeting.docx
+++ b/docs/Minutes of Meeting.docx
@@ -206,7 +206,7 @@
           <w:szCs w:val="24"/>
           <w:highlight w:val="yellow"/>
         </w:rPr>
-        <w:t>Convert lại sau khi predict để plot lại (dành cho lúc chạy LSTM)</w:t>
+        <w:t>Convert lại sau khi predict để plot lại</w:t>
       </w:r>
     </w:p>
     <w:p>
@@ -225,9 +225,15 @@
         <w:rPr>
           <w:sz w:val="24"/>
           <w:szCs w:val="24"/>
-          <w:highlight w:val="yellow"/>
         </w:rPr>
         <w:t>Tuần sau chạy báo cáo LSTM &amp; CNN (chủ yếu CNN vì chưa chạy)</w:t>
+      </w:r>
+      <w:r>
+        <w:rPr>
+          <w:sz w:val="24"/>
+          <w:szCs w:val="24"/>
+        </w:rPr>
+        <w:t xml:space="preserve"> (Done)</w:t>
       </w:r>
     </w:p>
     <w:sectPr>

</xml_diff>

<commit_message>
Run LSTM models with new time_step
</commit_message>
<xml_diff>
--- a/docs/Minutes of Meeting.docx
+++ b/docs/Minutes of Meeting.docx
@@ -25,7 +25,6 @@
     <w:p>
       <w:pPr>
         <w:pStyle w:val="Heading1"/>
-        <w:spacing w:after="120"/>
       </w:pPr>
       <w:r>
         <w:t>Ngày 27/03/2024</w:t>
@@ -234,6 +233,135 @@
           <w:szCs w:val="24"/>
         </w:rPr>
         <w:t xml:space="preserve"> (Done)</w:t>
+      </w:r>
+    </w:p>
+    <w:p>
+      <w:pPr>
+        <w:pStyle w:val="Heading1"/>
+      </w:pPr>
+      <w:r>
+        <w:t>Ngày  04/04/2024</w:t>
+      </w:r>
+    </w:p>
+    <w:p>
+      <w:pPr>
+        <w:pStyle w:val="ListParagraph"/>
+        <w:numPr>
+          <w:ilvl w:val="0"/>
+          <w:numId w:val="1"/>
+        </w:numPr>
+        <w:rPr>
+          <w:sz w:val="24"/>
+          <w:szCs w:val="24"/>
+          <w:highlight w:val="yellow"/>
+        </w:rPr>
+      </w:pPr>
+      <w:r>
+        <w:rPr>
+          <w:sz w:val="24"/>
+          <w:szCs w:val="24"/>
+          <w:highlight w:val="yellow"/>
+        </w:rPr>
+        <w:t>Rà lại chỗ Time_step &amp; batch size (thay phiên giữ lại 1 trong 2 &amp; thay đổi cái còn lại để coi thử mô hình ra sao)</w:t>
+      </w:r>
+    </w:p>
+    <w:p>
+      <w:pPr>
+        <w:pStyle w:val="ListParagraph"/>
+        <w:numPr>
+          <w:ilvl w:val="0"/>
+          <w:numId w:val="1"/>
+        </w:numPr>
+        <w:rPr>
+          <w:sz w:val="24"/>
+          <w:szCs w:val="24"/>
+          <w:highlight w:val="yellow"/>
+        </w:rPr>
+      </w:pPr>
+      <w:r>
+        <w:rPr>
+          <w:sz w:val="24"/>
+          <w:szCs w:val="24"/>
+          <w:highlight w:val="yellow"/>
+        </w:rPr>
+        <w:t>Xuất kqua ra file Excel sau khi Train coi thử coi trước khi train &amp; sau khi train, số lượng mẫu giống nhau không</w:t>
+      </w:r>
+    </w:p>
+    <w:p>
+      <w:pPr>
+        <w:pStyle w:val="ListParagraph"/>
+        <w:numPr>
+          <w:ilvl w:val="0"/>
+          <w:numId w:val="1"/>
+        </w:numPr>
+        <w:rPr>
+          <w:sz w:val="24"/>
+          <w:szCs w:val="24"/>
+          <w:highlight w:val="yellow"/>
+        </w:rPr>
+      </w:pPr>
+      <w:r>
+        <w:rPr>
+          <w:sz w:val="24"/>
+          <w:szCs w:val="24"/>
+          <w:highlight w:val="yellow"/>
+        </w:rPr>
+        <w:t>Check thêm lại khúc num_samples &amp; num_feature (input array dưới dạng 3D)</w:t>
+      </w:r>
+    </w:p>
+    <w:p>
+      <w:pPr>
+        <w:pStyle w:val="ListParagraph"/>
+        <w:numPr>
+          <w:ilvl w:val="0"/>
+          <w:numId w:val="1"/>
+        </w:numPr>
+        <w:rPr>
+          <w:sz w:val="24"/>
+          <w:szCs w:val="24"/>
+        </w:rPr>
+      </w:pPr>
+      <w:r>
+        <w:rPr>
+          <w:sz w:val="24"/>
+          <w:szCs w:val="24"/>
+        </w:rPr>
+        <w:t xml:space="preserve">Giả định time step là sl mẫu, nếu chọn tim estep = 1 </w:t>
+      </w:r>
+      <w:r>
+        <w:rPr>
+          <w:sz w:val="24"/>
+          <w:szCs w:val="24"/>
+        </w:rPr>
+        <w:sym w:font="Wingdings" w:char="F0E0"/>
+      </w:r>
+      <w:r>
+        <w:rPr>
+          <w:sz w:val="24"/>
+          <w:szCs w:val="24"/>
+        </w:rPr>
+        <w:t xml:space="preserve"> sl mẫu đưa vào mô hình chỉ 1, nếu timestep càng cao thì sẽ chạy càng nhanh </w:t>
+      </w:r>
+      <w:r>
+        <w:rPr>
+          <w:sz w:val="24"/>
+          <w:szCs w:val="24"/>
+        </w:rPr>
+        <w:sym w:font="Wingdings" w:char="F0E8"/>
+      </w:r>
+      <w:r>
+        <w:rPr>
+          <w:sz w:val="24"/>
+          <w:szCs w:val="24"/>
+        </w:rPr>
+        <w:t xml:space="preserve"> chạy timestep = 1 &amp; 21 (giữ batch size lại)</w:t>
+      </w:r>
+      <w:r>
+        <w:rPr>
+          <w:sz w:val="24"/>
+          <w:szCs w:val="24"/>
+        </w:rPr>
+        <w:t xml:space="preserve"> (Done – Time_Step = 21 chạy vẫn có điểm MAPE cao)</w:t>
       </w:r>
     </w:p>
     <w:sectPr>
@@ -775,11 +903,11 @@
     <w:link w:val="Heading1Char"/>
     <w:uiPriority w:val="9"/>
     <w:qFormat/>
-    <w:rsid w:val="00F840BA"/>
+    <w:rsid w:val="00BC275B"/>
     <w:pPr>
       <w:keepNext/>
       <w:keepLines/>
-      <w:spacing w:before="240" w:after="0"/>
+      <w:spacing w:before="240" w:after="120"/>
       <w:outlineLvl w:val="0"/>
     </w:pPr>
     <w:rPr>
@@ -821,7 +949,7 @@
     <w:basedOn w:val="DefaultParagraphFont"/>
     <w:link w:val="Heading1"/>
     <w:uiPriority w:val="9"/>
-    <w:rsid w:val="00F840BA"/>
+    <w:rsid w:val="00BC275B"/>
     <w:rPr>
       <w:rFonts w:asciiTheme="majorHAnsi" w:eastAsiaTheme="majorEastAsia" w:hAnsiTheme="majorHAnsi" w:cstheme="majorBidi"/>
       <w:color w:val="2F5496" w:themeColor="accent1" w:themeShade="BF"/>

</xml_diff>